<commit_message>
updated API base URL for production
</commit_message>
<xml_diff>
--- a/Full Stack/Links.docx
+++ b/Full Stack/Links.docx
@@ -94,53 +94,96 @@
           <w:szCs w:val="24"/>
         </w:rPr>
       </w:pPr>
+    </w:p>
+    <w:p>
+      <w:pPr>
+        <w:rPr>
+          <w:rFonts w:ascii="Times New Roman" w:hAnsi="Times New Roman" w:cs="Times New Roman"/>
+          <w:sz w:val="24"/>
+          <w:szCs w:val="24"/>
+        </w:rPr>
+      </w:pPr>
+      <w:r>
+        <w:rPr>
+          <w:rFonts w:ascii="Times New Roman" w:hAnsi="Times New Roman" w:cs="Times New Roman"/>
+          <w:sz w:val="24"/>
+          <w:szCs w:val="24"/>
+        </w:rPr>
+        <w:t xml:space="preserve">Link and QR of </w:t>
+      </w:r>
+      <w:proofErr w:type="gramStart"/>
+      <w:r>
+        <w:rPr>
+          <w:rFonts w:ascii="Times New Roman" w:hAnsi="Times New Roman" w:cs="Times New Roman"/>
+          <w:sz w:val="24"/>
+          <w:szCs w:val="24"/>
+        </w:rPr>
+        <w:t>website ,drive</w:t>
+      </w:r>
+      <w:proofErr w:type="gramEnd"/>
+      <w:r>
+        <w:rPr>
+          <w:rFonts w:ascii="Times New Roman" w:hAnsi="Times New Roman" w:cs="Times New Roman"/>
+          <w:sz w:val="24"/>
+          <w:szCs w:val="24"/>
+        </w:rPr>
+        <w:t xml:space="preserve"> ,</w:t>
+      </w:r>
+      <w:proofErr w:type="spellStart"/>
+      <w:r>
+        <w:rPr>
+          <w:rFonts w:ascii="Times New Roman" w:hAnsi="Times New Roman" w:cs="Times New Roman"/>
+          <w:sz w:val="24"/>
+          <w:szCs w:val="24"/>
+        </w:rPr>
+        <w:t>github</w:t>
+      </w:r>
+      <w:proofErr w:type="spellEnd"/>
+    </w:p>
+    <w:p>
+      <w:pPr>
+        <w:rPr>
+          <w:rFonts w:ascii="Times New Roman" w:hAnsi="Times New Roman" w:cs="Times New Roman"/>
+          <w:sz w:val="24"/>
+          <w:szCs w:val="24"/>
+        </w:rPr>
+      </w:pPr>
+    </w:p>
+    <w:p>
+      <w:pPr>
+        <w:rPr>
+          <w:rFonts w:ascii="Times New Roman" w:hAnsi="Times New Roman" w:cs="Times New Roman"/>
+          <w:sz w:val="24"/>
+          <w:szCs w:val="24"/>
+        </w:rPr>
+      </w:pPr>
+    </w:p>
+    <w:p>
+      <w:pPr>
+        <w:rPr>
+          <w:rFonts w:ascii="Times New Roman" w:hAnsi="Times New Roman" w:cs="Times New Roman"/>
+          <w:sz w:val="24"/>
+          <w:szCs w:val="24"/>
+        </w:rPr>
+      </w:pPr>
+      <w:r>
+        <w:rPr>
+          <w:rFonts w:ascii="Times New Roman" w:hAnsi="Times New Roman" w:cs="Times New Roman"/>
+          <w:sz w:val="24"/>
+          <w:szCs w:val="24"/>
+        </w:rPr>
+        <w:t xml:space="preserve">Render: </w:t>
+      </w:r>
+      <w:r>
+        <w:rPr>
+          <w:rFonts w:ascii="Times New Roman" w:hAnsi="Times New Roman" w:cs="Times New Roman"/>
+          <w:sz w:val="24"/>
+          <w:szCs w:val="24"/>
+        </w:rPr>
+        <w:t>https://rudraksha-computers.onrender.com</w:t>
+      </w:r>
       <w:bookmarkStart w:id="0" w:name="_GoBack"/>
       <w:bookmarkEnd w:id="0"/>
-    </w:p>
-    <w:p>
-      <w:pPr>
-        <w:rPr>
-          <w:rFonts w:ascii="Times New Roman" w:hAnsi="Times New Roman" w:cs="Times New Roman"/>
-          <w:sz w:val="24"/>
-          <w:szCs w:val="24"/>
-        </w:rPr>
-      </w:pPr>
-      <w:r>
-        <w:rPr>
-          <w:rFonts w:ascii="Times New Roman" w:hAnsi="Times New Roman" w:cs="Times New Roman"/>
-          <w:sz w:val="24"/>
-          <w:szCs w:val="24"/>
-        </w:rPr>
-        <w:t xml:space="preserve">Link and QR of </w:t>
-      </w:r>
-      <w:proofErr w:type="gramStart"/>
-      <w:r>
-        <w:rPr>
-          <w:rFonts w:ascii="Times New Roman" w:hAnsi="Times New Roman" w:cs="Times New Roman"/>
-          <w:sz w:val="24"/>
-          <w:szCs w:val="24"/>
-        </w:rPr>
-        <w:t>website ,drive</w:t>
-      </w:r>
-      <w:proofErr w:type="gramEnd"/>
-      <w:r>
-        <w:rPr>
-          <w:rFonts w:ascii="Times New Roman" w:hAnsi="Times New Roman" w:cs="Times New Roman"/>
-          <w:sz w:val="24"/>
-          <w:szCs w:val="24"/>
-        </w:rPr>
-        <w:t xml:space="preserve"> ,</w:t>
-      </w:r>
-      <w:proofErr w:type="spellStart"/>
-      <w:r>
-        <w:rPr>
-          <w:rFonts w:ascii="Times New Roman" w:hAnsi="Times New Roman" w:cs="Times New Roman"/>
-          <w:sz w:val="24"/>
-          <w:szCs w:val="24"/>
-        </w:rPr>
-        <w:t>github</w:t>
-      </w:r>
-      <w:proofErr w:type="spellEnd"/>
     </w:p>
     <w:sectPr>
       <w:pgSz w:w="12240" w:h="15840"/>

</xml_diff>

<commit_message>
fixed login error and updated API/CORS
</commit_message>
<xml_diff>
--- a/Full Stack/Links.docx
+++ b/Full Stack/Links.docx
@@ -109,25 +109,7 @@
           <w:sz w:val="24"/>
           <w:szCs w:val="24"/>
         </w:rPr>
-        <w:t xml:space="preserve">Link and QR of </w:t>
-      </w:r>
-      <w:proofErr w:type="gramStart"/>
-      <w:r>
-        <w:rPr>
-          <w:rFonts w:ascii="Times New Roman" w:hAnsi="Times New Roman" w:cs="Times New Roman"/>
-          <w:sz w:val="24"/>
-          <w:szCs w:val="24"/>
-        </w:rPr>
-        <w:t>website ,drive</w:t>
-      </w:r>
-      <w:proofErr w:type="gramEnd"/>
-      <w:r>
-        <w:rPr>
-          <w:rFonts w:ascii="Times New Roman" w:hAnsi="Times New Roman" w:cs="Times New Roman"/>
-          <w:sz w:val="24"/>
-          <w:szCs w:val="24"/>
-        </w:rPr>
-        <w:t xml:space="preserve"> ,</w:t>
+        <w:t>Link and QR of website ,drive ,</w:t>
       </w:r>
       <w:proofErr w:type="spellStart"/>
       <w:r>
@@ -174,14 +156,59 @@
         </w:rPr>
         <w:t xml:space="preserve">Render: </w:t>
       </w:r>
+      <w:hyperlink r:id="rId5" w:history="1">
+        <w:r>
+          <w:rPr>
+            <w:rStyle w:val="Hyperlink"/>
+            <w:rFonts w:ascii="Times New Roman" w:hAnsi="Times New Roman" w:cs="Times New Roman"/>
+            <w:sz w:val="24"/>
+            <w:szCs w:val="24"/>
+          </w:rPr>
+          <w:t>https://rudraksha-computers.onrender.com</w:t>
+        </w:r>
+      </w:hyperlink>
+    </w:p>
+    <w:p>
+      <w:pPr>
+        <w:rPr>
+          <w:rFonts w:ascii="Times New Roman" w:hAnsi="Times New Roman" w:cs="Times New Roman"/>
+          <w:sz w:val="24"/>
+          <w:szCs w:val="24"/>
+        </w:rPr>
+      </w:pPr>
+      <w:proofErr w:type="spellStart"/>
       <w:r>
         <w:rPr>
           <w:rFonts w:ascii="Times New Roman" w:hAnsi="Times New Roman" w:cs="Times New Roman"/>
           <w:sz w:val="24"/>
           <w:szCs w:val="24"/>
         </w:rPr>
-        <w:t>https://rudraksha-computers.onrender.com</w:t>
+        <w:t>Vercel</w:t>
       </w:r>
+      <w:proofErr w:type="spellEnd"/>
+      <w:r>
+        <w:rPr>
+          <w:rFonts w:ascii="Times New Roman" w:hAnsi="Times New Roman" w:cs="Times New Roman"/>
+          <w:sz w:val="24"/>
+          <w:szCs w:val="24"/>
+        </w:rPr>
+        <w:t xml:space="preserve">: </w:t>
+      </w:r>
+      <w:hyperlink r:id="rId6" w:tgtFrame="_blank" w:history="1">
+        <w:proofErr w:type="spellStart"/>
+        <w:r>
+          <w:rPr>
+            <w:rStyle w:val="Hyperlink"/>
+            <w:rFonts w:ascii="Arial" w:hAnsi="Arial" w:cs="Arial"/>
+            <w:sz w:val="21"/>
+            <w:szCs w:val="21"/>
+            <w:bdr w:val="single" w:sz="2" w:space="0" w:color="EBEBEB" w:frame="1"/>
+            <w:shd w:val="clear" w:color="auto" w:fill="FFFFFF"/>
+          </w:rPr>
+          <w:t>rudraksha-computers.vercel.app</w:t>
+        </w:r>
+        <w:proofErr w:type="spellEnd"/>
+      </w:hyperlink>
       <w:bookmarkStart w:id="0" w:name="_GoBack"/>
       <w:bookmarkEnd w:id="0"/>
     </w:p>

</xml_diff>